<commit_message>
Habilitar impresión de facturas y exportar reportes a Excel
El botón Imprimir ahora reconstruye la ruta del PDF por convención
cuando se reabre una factura ya guardada, en vez de depender de una
variable que solo tenía valor recién generado el PDF. Se agrega
ExportadorCsv para exportar el Reporte de Factura y el Reporte de
Inventario a un .csv que Excel abre directo, sin dependencias nuevas.
Se suman además el candado de FK en HFACTURA.cliente hacia CLIENTES y
la corrección de búsqueda de frmVENFACT que quedaban pendientes de
commit. Manuales actualizados.

Co-Authored-By: Claude Sonnet 5 <noreply@anthropic.com>
Claude-Session: https://claude.ai/code/session_01A7qJLjk9LiNk6hAgzzSQCp
</commit_message>
<xml_diff>
--- a/MANUAL_TECNICO.docx
+++ b/MANUAL_TECNICO.docx
@@ -76,7 +76,7 @@
           <w:color w:val="555555"/>
           <w:sz w:val="20"/>
         </w:rPr>
-        <w:t>Version del documento: 11/09/2026</w:t>
+        <w:t>Version del documento: 12/09/2026</w:t>
       </w:r>
     </w:p>
     <w:p>
@@ -520,6 +520,22 @@
         </w:rPr>
         <w:br/>
         <w:t>|   |   |-- ConvertImage.cs       Conversion byte[] &lt;-&gt; Image</w:t>
+      </w:r>
+      <w:r>
+        <w:rPr>
+          <w:rFonts w:ascii="Consolas" w:hAnsi="Consolas"/>
+          <w:sz w:val="18"/>
+        </w:rPr>
+        <w:br/>
+        <w:t>|   |   |-- ExportadorCsv.cs      Exporta un DataGridView a .csv (Excel), usado por</w:t>
+      </w:r>
+      <w:r>
+        <w:rPr>
+          <w:rFonts w:ascii="Consolas" w:hAnsi="Consolas"/>
+          <w:sz w:val="18"/>
+        </w:rPr>
+        <w:br/>
+        <w:t>|   |   |                         Reporte de Factura e Inventario</w:t>
       </w:r>
       <w:r>
         <w:rPr>
@@ -1021,7 +1037,7 @@
           </w:tcPr>
           <w:p>
             <w:r>
-              <w:t>PK factura. Incluye idTipoComprobante (FK a TIPOCOMPROBANTE) y comprobanteFiscal (el NCF usado)</w:t>
+              <w:t>PK factura. cliente es INT con FK a CLIENTES.idCliente (antes NVARCHAR sin llave: se pudo borrar un cliente con facturas directo en la base de datos, dejandolas huerfanas). Incluye idTipoComprobante (FK a TIPOCOMPROBANTE) y comprobanteFiscal (el NCF usado)</w:t>
             </w:r>
           </w:p>
         </w:tc>
@@ -1955,7 +1971,7 @@
           </w:tcPr>
           <w:p>
             <w:r>
-              <w:t>Alta de facturas (encabezado + lineas via DataGridView). La fecha es un DateTimePicker (dtpFechaFactura, formato dd/MM/yyyy) editable, no una etiqueta de solo lectura: arranca en la fecha de hoy pero se puede cambiar por factura</w:t>
+              <w:t>Alta de facturas (encabezado + lineas via DataGridView). La fecha es un DateTimePicker (dtpFechaFactura, formato dd/MM/yyyy) editable, no una etiqueta de solo lectura: arranca en la fecha de hoy pero se puede cambiar por factura. btnImprimir_Click ya funciona: antes dependia de la variable de instancia archivo, que solo tenia valor si la factura se acababa de generar en GenerarPDF() durante esa misma sesion, asi que imprimir una factura reabierta con la lupa no hacia nada. Ahora, si archivo esta vacio o el PDF ya no existe ahi, reconstruye la ruta por convencion (Facturas\Factura_&lt;numero&gt;.pdf, la misma que usa GenerarPDF) antes de enviarla a imprimir con el verbo print de Process.Start; si ese verbo no esta disponible (depende del lector de PDF instalado), abre el PDF igual para que se imprima a mano con Ctrl+P</w:t>
             </w:r>
           </w:p>
         </w:tc>
@@ -2043,7 +2059,7 @@
           </w:tcPr>
           <w:p>
             <w:r>
-              <w:t>Ventanas emergentes de busqueda (cliente, producto, factura) usadas desde Factura. btnCONFACT_Click (la lupa junto a Numero Factura) ya llama a frmVENFACT y carga la factura elegida con BuscarFactura(); antes solo abria la carpeta de PDFs. frmVENFACT busca por CLIENTE exacto (no por numero de factura ni por nombre), asi que hay que escribir el codigo del cliente</w:t>
+              <w:t>Ventanas emergentes de busqueda (cliente, producto, factura) usadas desde Factura. btnCONFACT_Click (la lupa junto a Numero Factura) ya llama a frmVENFACT y carga la factura elegida con BuscarFactura(); antes solo abria la carpeta de PDFs. BuscarFactura() tenia un typo (SELECT A.MONTOFACTURA en vez de A.MONTOFACTURADO, el nombre real de la columna en HFACTURA) que tiraba “Invalid column name” en cuanto se selecciona una factura; nadie lo habia notado porque este metodo nunca se habia ejecutado hasta que se conecto la busqueda. Ya corregido. frmVENFACT.BuscaData() tambien tenia un bug: a pesar de que el rotulo dice “Buscar Factura por ID”, filtraba por CLIENTE = @cliente en vez de por el numero de factura, asi que escribir un numero de factura real no encontraba nada. Ahora filtra FACTURA LIKE (parcial) y, si el campo esta vacio, muestra todas las facturas activas; frmVENFACT_Load tambien llama BuscaData() una vez al abrir para no empezar con la lista en blanco. btnSeleccionar_Click ademas avisa con un mensaje si no hay ninguna fila seleccionada, en vez de cerrar la ventana sin hacer nada. Por ultimo, BuscarFactura() hacia INNER JOIN CLIENTES B ON A.CLIENTE = B.IDCLIENTE: si el codigo de cliente guardado en esa factura no encontraba pareja exacta (espacio de mas, cliente muy viejo, etc.), la factura entera desaparecia de la busqueda sin ningun aviso — “a veces si, a veces no” segun la factura. Ahora es LEFT JOIN (la factura carga igual, solo el nombre del cliente queda vacio si no hay coincidencia) y, si de verdad no existe esa factura o esta anulada, muestra un MessageBox en vez de quedarse en silencio.</w:t>
             </w:r>
           </w:p>
         </w:tc>
@@ -2131,7 +2147,7 @@
           </w:tcPr>
           <w:p>
             <w:r>
-              <w:t>Lista HFACTURA con filtros (cliente, estado, rango de fecha) y permite anular una factura activa (llama FacturaService.AnularFactura); abierta desde Reporte -&gt; Factura</w:t>
+              <w:t>Lista HFACTURA con filtros (cliente, estado, rango de fecha) y permite anular una factura activa (llama FacturaService.AnularFactura); abierta desde Reporte -&gt; Factura. btnExportar_Click llama a ExportadorCsv.Exportar(this, dgv, "ReporteFactura.csv") para guardar la tabla filtrada en .csv</w:t>
             </w:r>
           </w:p>
         </w:tc>
@@ -2153,7 +2169,7 @@
           </w:tcPr>
           <w:p>
             <w:r>
-              <w:t>Lista PRODUCTOS activos con existencia, costo, precio, impuesto y valor en inventario (existencia x costo), con busqueda por codigo/descripcion; abierta desde Reporte -&gt; Inventario</w:t>
+              <w:t>Lista PRODUCTOS activos con existencia, costo, precio, impuesto y valor en inventario (existencia x costo), con busqueda por codigo/descripcion; abierta desde Reporte -&gt; Inventario. btnExportar_Click llama a ExportadorCsv.Exportar(this, dgv, "ReporteInventario.csv")</w:t>
             </w:r>
           </w:p>
         </w:tc>
@@ -2167,6 +2183,66 @@
           <w:i w:val="0"/>
         </w:rPr>
         <w:t>Patron repetido en casi todos los formularios de datos: BuscarData(), InsertarData() / ActualizaData(), BorrarData() (baja logica, no fisica), LimpiarFormulario().</w:t>
+      </w:r>
+    </w:p>
+    <w:p>
+      <w:pPr>
+        <w:pStyle w:val="Heading2"/>
+      </w:pPr>
+      <w:r>
+        <w:rPr>
+          <w:color w:val="1B1F3B"/>
+        </w:rPr>
+        <w:t>6.1 Exportar a Excel (Clases/ExportadorCsv.cs)</w:t>
+      </w:r>
+    </w:p>
+    <w:p>
+      <w:r>
+        <w:rPr>
+          <w:b w:val="0"/>
+          <w:i w:val="0"/>
+        </w:rPr>
+        <w:t>ExportadorCsv.Exportar(owner, dgv, nombreSugerido) es un metodo estatico reutilizado por frmReporteFactura y frmReporteInventario. En vez de agregar una libreria nueva para generar un .xlsx real (EPPlus/NPOI/ClosedXML), escribe un .csv: Excel lo abre directo con doble clic y no hace falta tener Excel instalado para generarlo, asi que fue la opcion sin dependencias nuevas.</w:t>
+      </w:r>
+    </w:p>
+    <w:p>
+      <w:pPr>
+        <w:pStyle w:val="ListBullet"/>
+      </w:pPr>
+      <w:r>
+        <w:t>Usa CultureInfo.CurrentCulture.TextInfo.ListSeparator como separador (en Windows configurado en espanol suele ser ";", no ","), para que Excel reconozca las columnas al abrir el archivo sin necesidad de importarlo a mano.</w:t>
+      </w:r>
+    </w:p>
+    <w:p>
+      <w:pPr>
+        <w:pStyle w:val="ListBullet"/>
+      </w:pPr>
+      <w:r>
+        <w:t>Escribe con UTF8Encoding(true) (con BOM) para que las tildes y la ñ se vean correctas al abrir en Excel.</w:t>
+      </w:r>
+    </w:p>
+    <w:p>
+      <w:pPr>
+        <w:pStyle w:val="ListBullet"/>
+      </w:pPr>
+      <w:r>
+        <w:t>Escapa cada valor entre comillas si contiene el separador, comillas o saltos de linea (duplicando las comillas internas, regla estandar de CSV).</w:t>
+      </w:r>
+    </w:p>
+    <w:p>
+      <w:pPr>
+        <w:pStyle w:val="ListBullet"/>
+      </w:pPr>
+      <w:r>
+        <w:t>Toma directamente las columnas y filas visibles del DataGridView que recibe, asi que exporta exactamente lo que el usuario ve en pantalla, ya filtrado.</w:t>
+      </w:r>
+    </w:p>
+    <w:p>
+      <w:pPr>
+        <w:pStyle w:val="ListBullet"/>
+      </w:pPr>
+      <w:r>
+        <w:t>Al terminar, pregunta si se quiere abrir el archivo de una vez (Process.Start con UseShellExecute = true).</w:t>
       </w:r>
     </w:p>
     <w:p>
@@ -2428,6 +2504,14 @@
       </w:r>
     </w:p>
     <w:p>
+      <w:pPr>
+        <w:pStyle w:val="ListBullet"/>
+      </w:pPr>
+      <w:r>
+        <w:t>HFACTURA.cliente no tenia llave foranea hacia CLIENTES (y encima era NVARCHAR, no INT): se podia borrar un cliente directo en la base de datos aunque tuviera facturas, dejandolas “huerfanas” (con un codigo de cliente que ya no existe) sin ningun aviso — fue justo lo que le paso a este proyecto y motivo el cambio de BuscarFactura() a LEFT JOIN (ver tabla de formularios, seccion 6). Se corrigio de raiz en crear_base_datos.sql: cliente se convierte a INT y se agrega FK_HFACTURA_CLIENTES con NOCHECK (no valida las facturas que ya hayan quedado huerfanas, pero de aqui en adelante ya no deja borrar un cliente que todavia tenga facturas).</w:t>
+      </w:r>
+    </w:p>
+    <w:p>
       <w:r>
         <w:rPr>
           <w:b w:val="0"/>
@@ -2653,7 +2737,7 @@
         <w:pStyle w:val="ListBullet"/>
       </w:pPr>
       <w:r>
-        <w:t>frmVENFACT (usado por la lupa de Numero Factura y por Reporte de Factura para ver facturas de un cliente) busca por CLIENTE exacto, no por nombre ni con LIKE como frmVENCTE/frmVENPRO: falta agregarle busqueda parcial por nombre de cliente.</w:t>
+        <w:t>frmVENFACT (usado por la lupa de Numero Factura en frmFactura) ya busca por FACTURA con LIKE y muestra todas las activas si el campo queda vacio, pero solo por numero de factura: no tiene forma de buscar por cliente o por nombre desde ahi (para eso esta Reporte de Factura, que si filtra por cliente).</w:t>
       </w:r>
     </w:p>
     <w:p>
@@ -2661,7 +2745,7 @@
         <w:pStyle w:val="ListBullet"/>
       </w:pPr>
       <w:r>
-        <w:t>Los reportes (Reporte de Factura y Reporte de Inventario) son tablas en pantalla nada mas: no tienen boton para imprimir ni exportar a PDF/Excel todavia.</w:t>
+        <w:t>Los reportes (Reporte de Factura y Reporte de Inventario) ya se pueden exportar a .csv (Excel) con el boton Exportar, pero todavia no tienen opcion de exportar o imprimir en PDF.</w:t>
       </w:r>
     </w:p>
     <w:p>

</xml_diff>

<commit_message>
Agregar Punto de Venta rápido y corregir selección por teclado en búsqueda de cliente
Nueva pantalla frmPuntoVenta para ventas de mostrador: escanear/escribir
un código agrega la línea con Enter, Cobrar (F2) guarda, genera el PDF
e imprime en un solo paso. Reutiliza la lógica existente en vez de
duplicarla: se extrajo GuardarFactura/GenerarPdf/ImprimirPdf a
FacturaService (frmFactura ahora también los usa) y se reutilizan
frmVENCTE (cliente) y frmCambiarComprobante (NCF). Se agrega el
cliente semilla "Consumidor Final".

De paso se corrige frmVENCTE: "Seleccionar" guardaba el cliente pero
nunca cerraba el diálogo, así que parecía no hacer nada. Ahora cierra
al seleccionar, y se agrega Enter para elegir y Tab/flechas para
moverse por la lista.

Manuales actualizados.

Co-Authored-By: Claude Sonnet 5 <noreply@anthropic.com>
Claude-Session: https://claude.ai/code/session_01A7qJLjk9LiNk6hAgzzSQCp
</commit_message>
<xml_diff>
--- a/MANUAL_TECNICO.docx
+++ b/MANUAL_TECNICO.docx
@@ -877,7 +877,7 @@
           </w:tcPr>
           <w:p>
             <w:r>
-              <w:t>idCiudad -&gt; CIUDADES, idEstatus -&gt; mESTATUSCTE</w:t>
+              <w:t>idCiudad -&gt; CIUDADES, idEstatus -&gt; mESTATUSCTE. Trae sembrado un cliente “Consumidor Final” (semilla idempotente en crear_base_datos.sql), usado como cliente por defecto en frmPuntoVenta</w:t>
             </w:r>
           </w:p>
         </w:tc>
@@ -2059,7 +2059,7 @@
           </w:tcPr>
           <w:p>
             <w:r>
-              <w:t>Ventanas emergentes de busqueda (cliente, producto, factura) usadas desde Factura. btnCONFACT_Click (la lupa junto a Numero Factura) ya llama a frmVENFACT y carga la factura elegida con BuscarFactura(); antes solo abria la carpeta de PDFs. BuscarFactura() tenia un typo (SELECT A.MONTOFACTURA en vez de A.MONTOFACTURADO, el nombre real de la columna en HFACTURA) que tiraba “Invalid column name” en cuanto se selecciona una factura; nadie lo habia notado porque este metodo nunca se habia ejecutado hasta que se conecto la busqueda. Ya corregido. frmVENFACT.BuscaData() tambien tenia un bug: a pesar de que el rotulo dice “Buscar Factura por ID”, filtraba por CLIENTE = @cliente en vez de por el numero de factura, asi que escribir un numero de factura real no encontraba nada. Ahora filtra FACTURA LIKE (parcial) y, si el campo esta vacio, muestra todas las facturas activas; frmVENFACT_Load tambien llama BuscaData() una vez al abrir para no empezar con la lista en blanco. btnSeleccionar_Click ademas avisa con un mensaje si no hay ninguna fila seleccionada, en vez de cerrar la ventana sin hacer nada. Por ultimo, BuscarFactura() hacia INNER JOIN CLIENTES B ON A.CLIENTE = B.IDCLIENTE: si el codigo de cliente guardado en esa factura no encontraba pareja exacta (espacio de mas, cliente muy viejo, etc.), la factura entera desaparecia de la busqueda sin ningun aviso — “a veces si, a veces no” segun la factura. Ahora es LEFT JOIN (la factura carga igual, solo el nombre del cliente queda vacio si no hay coincidencia) y, si de verdad no existe esa factura o esta anulada, muestra un MessageBox en vez de quedarse en silencio.</w:t>
+              <w:t>Ventanas emergentes de busqueda (cliente, producto, factura) usadas desde Factura. btnCONFACT_Click (la lupa junto a Numero Factura) ya llama a frmVENFACT y carga la factura elegida con BuscarFactura(); antes solo abria la carpeta de PDFs. BuscarFactura() tenia un typo (SELECT A.MONTOFACTURA en vez de A.MONTOFACTURADO, el nombre real de la columna en HFACTURA) que tiraba “Invalid column name” en cuanto se selecciona una factura; nadie lo habia notado porque este metodo nunca se habia ejecutado hasta que se conecto la busqueda. Ya corregido. frmVENFACT.BuscaData() tambien tenia un bug: a pesar de que el rotulo dice “Buscar Factura por ID”, filtraba por CLIENTE = @cliente en vez de por el numero de factura, asi que escribir un numero de factura real no encontraba nada. Ahora filtra FACTURA LIKE (parcial) y, si el campo esta vacio, muestra todas las facturas activas; frmVENFACT_Load tambien llama BuscaData() una vez al abrir para no empezar con la lista en blanco. btnSeleccionar_Click ademas avisa con un mensaje si no hay ninguna fila seleccionada, en vez de cerrar la ventana sin hacer nada. Por ultimo, BuscarFactura() hacia INNER JOIN CLIENTES B ON A.CLIENTE = B.IDCLIENTE: si el codigo de cliente guardado en esa factura no encontraba pareja exacta (espacio de mas, cliente muy viejo, etc.), la factura entera desaparecia de la busqueda sin ningun aviso — “a veces si, a veces no” segun la factura. Ahora es LEFT JOIN (la factura carga igual, solo el nombre del cliente queda vacio si no hay coincidencia) y, si de verdad no existe esa factura o esta anulada, muestra un MessageBox en vez de quedarse en silencio. frmVENCTE.btnSeleccionar_Click tenia el mismo bug de fondo que frmVENFACT: guardaba var1/var2 pero nunca cerraba el dialogo, asi que quien llamaba ShowDialog() (frmFactura, frmPuntoVenta) se quedaba esperando y “Seleccionar” parecia no hacer nada hasta cerrar la ventana a mano. Ahora SeleccionarClienteActual() hace DialogResult = OK y Close() al elegir. De paso se agrego navegacion por teclado en su dgv: Enter selecciona (igual que el boton), y Tab/Shift+Tab mueven la fila activa hacia abajo/arriba en vez de saltar de columna (las flechas arriba/abajo ya navegaban filas por comportamiento nativo de DataGridView, pero necesitaban una celda activa; BuscaData() ahora deja seleccionada la primera fila tras cada busqueda para que funcionen de inmediato). SelectionMode se puso en FullRowSelect para que se vea resaltada la fila completa, no solo una celda.</w:t>
             </w:r>
           </w:p>
         </w:tc>
@@ -2174,6 +2174,28 @@
           </w:p>
         </w:tc>
       </w:tr>
+      <w:tr>
+        <w:tc>
+          <w:tcPr>
+            <w:tcW w:type="dxa" w:w="2835"/>
+          </w:tcPr>
+          <w:p>
+            <w:r>
+              <w:t>frmPuntoVenta</w:t>
+            </w:r>
+          </w:p>
+        </w:tc>
+        <w:tc>
+          <w:tcPr>
+            <w:tcW w:type="dxa" w:w="5669"/>
+          </w:tcPr>
+          <w:p>
+            <w:r>
+              <w:t>Venta rapida de mostrador (menu Punto de Venta): escribir/escanear un codigo y Enter agrega la linea (o suma la cantidad si el articulo ya estaba en el carrito); Cobrar (F2) guarda la factura, genera el PDF y lo manda a imprimir en un solo paso. Cliente por defecto “Consumidor Final” (Cambiar = F4, reutiliza frmVENCTE) y Tipo de Comprobante preseleccionado en el primero cuyo nombre contenga “Consumo”. No duplica logica de negocio: llama a los mismos ComprobanteFiscal/FacturaService que usa frmFactura (ver 6.1 Reuso de FacturaService)</w:t>
+            </w:r>
+          </w:p>
+        </w:tc>
+      </w:tr>
     </w:tbl>
     <w:p/>
     <w:p>
@@ -2193,7 +2215,161 @@
         <w:rPr>
           <w:color w:val="1B1F3B"/>
         </w:rPr>
-        <w:t>6.1 Exportar a Excel (Clases/ExportadorCsv.cs)</w:t>
+        <w:t>6.1 Reuso de FacturaService entre frmFactura y frmPuntoVenta</w:t>
+      </w:r>
+    </w:p>
+    <w:p>
+      <w:r>
+        <w:rPr>
+          <w:b w:val="0"/>
+          <w:i w:val="0"/>
+        </w:rPr>
+        <w:t>Clases/FacturaService.cs concentra toda la logica de guardado e impresion de una factura, para que frmFactura y frmPuntoVenta sean sólo dos interfaces distintas sobre el mismo motor (mostrador rapido vs. captura detallada), sin dos copias de la transaccion que se puedan ir desalineando con el tiempo:</w:t>
+      </w:r>
+    </w:p>
+    <w:tbl>
+      <w:tblPr>
+        <w:tblStyle w:val="TableGrid"/>
+        <w:tblW w:type="auto" w:w="0"/>
+        <w:jc w:val="center"/>
+        <w:tblLook w:firstColumn="1" w:firstRow="1" w:lastColumn="0" w:lastRow="0" w:noHBand="0" w:noVBand="1" w:val="04A0"/>
+      </w:tblPr>
+      <w:tblGrid>
+        <w:gridCol w:w="4703"/>
+        <w:gridCol w:w="4703"/>
+      </w:tblGrid>
+      <w:tr>
+        <w:tc>
+          <w:tcPr>
+            <w:tcW w:type="dxa" w:w="3685"/>
+            <w:shd w:val="clear" w:color="auto" w:fill="1B1F3B"/>
+          </w:tcPr>
+          <w:p>
+            <w:r/>
+            <w:r>
+              <w:rPr>
+                <w:b/>
+                <w:color w:val="FFFFFF"/>
+              </w:rPr>
+              <w:t>Metodo</w:t>
+            </w:r>
+          </w:p>
+        </w:tc>
+        <w:tc>
+          <w:tcPr>
+            <w:tcW w:type="dxa" w:w="5102"/>
+            <w:shd w:val="clear" w:color="auto" w:fill="1B1F3B"/>
+          </w:tcPr>
+          <w:p>
+            <w:r/>
+            <w:r>
+              <w:rPr>
+                <w:b/>
+                <w:color w:val="FFFFFF"/>
+              </w:rPr>
+              <w:t>Que hace</w:t>
+            </w:r>
+          </w:p>
+        </w:tc>
+      </w:tr>
+      <w:tr>
+        <w:tc>
+          <w:tcPr>
+            <w:tcW w:type="dxa" w:w="3685"/>
+          </w:tcPr>
+          <w:p>
+            <w:r>
+              <w:t>GuardarFactura(numeroFactura, cliente, fecha, tipo, comprobante, lineas, subtotal, impuesto, total)</w:t>
+            </w:r>
+          </w:p>
+        </w:tc>
+        <w:tc>
+          <w:tcPr>
+            <w:tcW w:type="dxa" w:w="5102"/>
+          </w:tcPr>
+          <w:p>
+            <w:r>
+              <w:t>Inserta HFACTURA + DFACTURA, actualiza la secuencia de factura y la del comprobante fiscal, y descuenta el inventario de cada linea, todo en una sola transaccion. Si numeroFactura viene vacio (uso de frmPuntoVenta, que no necesita mostrarlo antes de cobrar) lo asigna aqui mismo con Busco.BuscaUltimoNumero("2"); si ya viene con un valor (el que frmFactura ya mostro en pantalla) usa ese mismo. Valida el comprobante con ComprobanteFiscal.ValidarFormato() antes de tocar la base de datos</w:t>
+            </w:r>
+          </w:p>
+        </w:tc>
+      </w:tr>
+      <w:tr>
+        <w:tc>
+          <w:tcPr>
+            <w:tcW w:type="dxa" w:w="3685"/>
+          </w:tcPr>
+          <w:p>
+            <w:r>
+              <w:t>GenerarPdf(numeroFactura, comprobante, fecha, clienteNombre, lineas, subtotal, impuesto, total)</w:t>
+            </w:r>
+          </w:p>
+        </w:tc>
+        <w:tc>
+          <w:tcPr>
+            <w:tcW w:type="dxa" w:w="5102"/>
+          </w:tcPr>
+          <w:p>
+            <w:r>
+              <w:t>Genera el PDF en Facturas\Factura_&lt;numero&gt;.pdf (misma ruta que ya esperaba frmFactura.btnImprimir_Click) y devuelve la ruta</w:t>
+            </w:r>
+          </w:p>
+        </w:tc>
+      </w:tr>
+      <w:tr>
+        <w:tc>
+          <w:tcPr>
+            <w:tcW w:type="dxa" w:w="3685"/>
+          </w:tcPr>
+          <w:p>
+            <w:r>
+              <w:t>ImprimirPdf(archivo)</w:t>
+            </w:r>
+          </w:p>
+        </w:tc>
+        <w:tc>
+          <w:tcPr>
+            <w:tcW w:type="dxa" w:w="5102"/>
+          </w:tcPr>
+          <w:p>
+            <w:r>
+              <w:t>Envia el PDF a la impresora predeterminada (verbo "print" del shell); si ese verbo no esta disponible, abre el PDF igual como respaldo. Devuelve true/false segun cual de los dos paso, para que el llamador decida el mensaje. La usan tanto frmFactura.btnImprimir_Click como frmPuntoVenta.btnCobrar_Click (que ademas ignora un fallo de impresion: la venta ya quedo guardada, sólo no se pudo mandar a imprimir)</w:t>
+            </w:r>
+          </w:p>
+        </w:tc>
+      </w:tr>
+    </w:tbl>
+    <w:p/>
+    <w:p>
+      <w:r>
+        <w:rPr>
+          <w:b w:val="0"/>
+          <w:i w:val="0"/>
+        </w:rPr>
+        <w:t>LineaFactura (Articulo, Descripcion, Cantidad, PrecioVenta, Impuesto, MontoLinea) es la línea ya calculada que ambos formularios arman antes de llamar a GuardarFactura()/GenerarPdf(). frmFactura la arma leyendo su dgv (ArmarLineas()); frmPuntoVenta usa una subclase privada LineaCarrito que le agrega TasaImpuesto e ImpuestoIncluido (necesarios para recalcular una linea si el cajero corrige la cantidad a mano), y al cobrar convierte cada fila del carrito directo a LineaFactura sin duplicar campos.</w:t>
+      </w:r>
+    </w:p>
+    <w:p>
+      <w:pPr>
+        <w:ind w:left="283"/>
+      </w:pPr>
+      <w:r>
+        <w:rPr>
+          <w:i/>
+          <w:color w:val="555555"/>
+        </w:rPr>
+        <w:t>Nota: MontoLinea guarda el subtotal de la linea (sin impuesto), aunque el nombre de la columna DFACTURA.MONTOLINEA sugiera lo contrario: es un nombre heredado del diseño original de la tabla, no un error nuevo de este reuso.</w:t>
+      </w:r>
+    </w:p>
+    <w:p>
+      <w:pPr>
+        <w:pStyle w:val="Heading2"/>
+      </w:pPr>
+      <w:r>
+        <w:rPr>
+          <w:color w:val="1B1F3B"/>
+        </w:rPr>
+        <w:t>6.2 Exportar a Excel (Clases/ExportadorCsv.cs)</w:t>
       </w:r>
     </w:p>
     <w:p>
@@ -2254,7 +2430,7 @@
           <w:i/>
           <w:color w:val="555555"/>
         </w:rPr>
-        <w:t>Nota: En frmMenu estan conectados a un formulario los items Registro -&gt; Productos, Cliente, Usuario y Factura, Configuracion -&gt; Comprobantes Fiscales, Reporte -&gt; Factura e Inventario, ademas de Salir y Cerrar Sesion. Los menus Consulta, los items Opciones del Menu / Permiso a Usuario dentro de Configuracion, y Puesto de Trabajo / Departamento dentro de Registro, existen visualmente pero no tienen manejador de clic (_Click) implementado todavia.</w:t>
+        <w:t>Nota: En frmMenu estan conectados a un formulario los items Registro -&gt; Productos, Cliente, Usuario y Factura, Punto de Venta (item de primer nivel, junto a Registro), Configuracion -&gt; Comprobantes Fiscales, Reporte -&gt; Factura e Inventario, ademas de Salir y Cerrar Sesion. Los menus Consulta, los items Opciones del Menu / Permiso a Usuario dentro de Configuracion, y Puesto de Trabajo / Departamento dentro de Registro, existen visualmente pero no tienen manejador de clic (_Click) implementado todavia.</w:t>
       </w:r>
     </w:p>
     <w:p>
@@ -2780,6 +2956,14 @@
         <w:t>Los comprobantes fiscales (ver seccion 5.2) ya manejan rango autorizado, minimo de alerta y vencimiento informativo, pero todavia no envian los electronicos a la DGII ni generan los reportes 606/607; la fecha de vencimiento tampoco bloquea nada por si sola, solo se muestra.</w:t>
       </w:r>
     </w:p>
+    <w:p>
+      <w:pPr>
+        <w:pStyle w:val="ListBullet"/>
+      </w:pPr>
+      <w:r>
+        <w:t>frmPuntoVenta (igual que frmFactura) no valida la existencia contra el inventario antes de vender: se puede cobrar mas cantidad de un articulo de la que hay en PRODUCTOS.cantidad, dejandola en negativo.</w:t>
+      </w:r>
+    </w:p>
     <w:sectPr>
       <w:pgSz w:w="12240" w:h="15840"/>
       <w:pgMar w:top="1134" w:right="1417" w:bottom="1134" w:left="1417" w:header="720" w:footer="720" w:gutter="0"/>

</xml_diff>

<commit_message>
Unificar la búsqueda de artículos y permitir nombre libre para Consumidor Final en Factura
Nueva pantalla frmConsultaArticulos (código o descripción, con
existencia/precio/impuesto y botón Nuevo Producto) compartida por
frmFactura (F4 en Artículo, antes código muerto) y frmPuntoVenta
(Buscar/F3), en vez de que cada una tuviera su propio buscador.
frmVENPRO queda sin uso.

frmFactura recibe el mismo tratamiento de cliente que Punto de Venta:
el nombre (ahora txtNombre, antes una etiqueta) se puede escribir
libremente sólo mientras el cliente activo es "Consumidor Final", para
poner el nombre real del comprador en el recibo sin registrarlo como
cliente nuevo; con cualquier otro cliente ya registrado queda de solo
lectura.

Manuales actualizados.

Co-Authored-By: Claude Sonnet 5 <noreply@anthropic.com>
Claude-Session: https://claude.ai/code/session_01A7qJLjk9LiNk6hAgzzSQCp
</commit_message>
<xml_diff>
--- a/MANUAL_TECNICO.docx
+++ b/MANUAL_TECNICO.docx
@@ -1971,7 +1971,7 @@
           </w:tcPr>
           <w:p>
             <w:r>
-              <w:t>Alta de facturas (encabezado + lineas via DataGridView). La fecha es un DateTimePicker (dtpFechaFactura, formato dd/MM/yyyy) editable, no una etiqueta de solo lectura: arranca en la fecha de hoy pero se puede cambiar por factura. btnImprimir_Click ya funciona: antes dependia de la variable de instancia archivo, que solo tenia valor si la factura se acababa de generar en GenerarPDF() durante esa misma sesion, asi que imprimir una factura reabierta con la lupa no hacia nada. Ahora, si archivo esta vacio o el PDF ya no existe ahi, reconstruye la ruta por convencion (Facturas\Factura_&lt;numero&gt;.pdf, la misma que usa GenerarPDF) antes de enviarla a imprimir con el verbo print de Process.Start; si ese verbo no esta disponible (depende del lector de PDF instalado), abre el PDF igual para que se imprima a mano con Ctrl+P</w:t>
+              <w:t>Alta de facturas (encabezado + lineas via DataGridView). La fecha es un DateTimePicker (dtpFechaFactura, formato dd/MM/yyyy) editable, no una etiqueta de solo lectura: arranca en la fecha de hoy pero se puede cambiar por factura. btnImprimir_Click ya funciona: antes dependia de la variable de instancia archivo, que solo tenia valor si la factura se acababa de generar en GenerarPDF() durante esa misma sesion, asi que imprimir una factura reabierta con la lupa no hacia nada. Ahora, si archivo esta vacio o el PDF ya no existe ahi, reconstruye la ruta por convencion (Facturas\Factura_&lt;numero&gt;.pdf, la misma que usa GenerarPDF) antes de enviarla a imprimir con el verbo print de Process.Start; si ese verbo no esta disponible (depende del lector de PDF instalado), abre el PDF igual para que se imprima a mano con Ctrl+P. btnArticulo_Click era codigo muerto (llamaba a frmVENPRO comentado, sin ejecutarse nunca); ahora abre frmConsultaArticulos (compartida con frmPuntoVenta) y, si se elige un producto, carga txtArticulo y llama BuscarArticulo() igual que si se hubiera escrito el codigo a mano; txtArticulo_KeyDown ya tenia F4 conectado a este boton desde antes, tambien sin efecto hasta ahora. lblNombre paso de Label a TextBox (txtNombre): ActualizarEditabilidadNombre(idCliente) lo deja de solo lectura salvo que el cliente activo sea consumidorFinalId (cargado en CargarConsumidorFinalId(), llamada desde frmFactura_Load), mismo criterio que frmPuntoVenta.AplicarCliente(): permite escribir el nombre real del comprador en el recibo de una venta a Consumidor Final sin crear un cliente nuevo, sin poder alterar el nombre de un cliente ya registrado. Se llama desde BuscarCliente(), BuscarFactura() y btnVENCTE_Click(), los tres puntos donde se fija txtCliente/txtNombre</w:t>
             </w:r>
           </w:p>
         </w:tc>
@@ -2059,7 +2059,7 @@
           </w:tcPr>
           <w:p>
             <w:r>
-              <w:t>Ventanas emergentes de busqueda (cliente, producto, factura) usadas desde Factura. btnCONFACT_Click (la lupa junto a Numero Factura) ya llama a frmVENFACT y carga la factura elegida con BuscarFactura(); antes solo abria la carpeta de PDFs. BuscarFactura() tenia un typo (SELECT A.MONTOFACTURA en vez de A.MONTOFACTURADO, el nombre real de la columna en HFACTURA) que tiraba “Invalid column name” en cuanto se selecciona una factura; nadie lo habia notado porque este metodo nunca se habia ejecutado hasta que se conecto la busqueda. Ya corregido. frmVENFACT.BuscaData() tambien tenia un bug: a pesar de que el rotulo dice “Buscar Factura por ID”, filtraba por CLIENTE = @cliente en vez de por el numero de factura, asi que escribir un numero de factura real no encontraba nada. Ahora filtra FACTURA LIKE (parcial) y, si el campo esta vacio, muestra todas las facturas activas; frmVENFACT_Load tambien llama BuscaData() una vez al abrir para no empezar con la lista en blanco. btnSeleccionar_Click ademas avisa con un mensaje si no hay ninguna fila seleccionada, en vez de cerrar la ventana sin hacer nada. Por ultimo, BuscarFactura() hacia INNER JOIN CLIENTES B ON A.CLIENTE = B.IDCLIENTE: si el codigo de cliente guardado en esa factura no encontraba pareja exacta (espacio de mas, cliente muy viejo, etc.), la factura entera desaparecia de la busqueda sin ningun aviso — “a veces si, a veces no” segun la factura. Ahora es LEFT JOIN (la factura carga igual, solo el nombre del cliente queda vacio si no hay coincidencia) y, si de verdad no existe esa factura o esta anulada, muestra un MessageBox en vez de quedarse en silencio. frmVENCTE.btnSeleccionar_Click tenia el mismo bug de fondo que frmVENFACT: guardaba var1/var2 pero nunca cerraba el dialogo, asi que quien llamaba ShowDialog() (frmFactura, frmPuntoVenta) se quedaba esperando y “Seleccionar” parecia no hacer nada hasta cerrar la ventana a mano. Ahora SeleccionarClienteActual() hace DialogResult = OK y Close() al elegir. De paso se agrego navegacion por teclado en su dgv: Enter selecciona (igual que el boton), y Tab/Shift+Tab mueven la fila activa hacia abajo/arriba en vez de saltar de columna (las flechas arriba/abajo ya navegaban filas por comportamiento nativo de DataGridView, pero necesitaban una celda activa; BuscaData() ahora deja seleccionada la primera fila tras cada busqueda para que funcionen de inmediato). SelectionMode se puso en FullRowSelect para que se vea resaltada la fila completa, no solo una celda.</w:t>
+              <w:t>Ventanas emergentes de busqueda (cliente, producto, factura) usadas desde Factura. btnCONFACT_Click (la lupa junto a Numero Factura) ya llama a frmVENFACT y carga la factura elegida con BuscarFactura(); antes solo abria la carpeta de PDFs. BuscarFactura() tenia un typo (SELECT A.MONTOFACTURA en vez de A.MONTOFACTURADO, el nombre real de la columna en HFACTURA) que tiraba “Invalid column name” en cuanto se selecciona una factura; nadie lo habia notado porque este metodo nunca se habia ejecutado hasta que se conecto la busqueda. Ya corregido. frmVENFACT.BuscaData() tambien tenia un bug: a pesar de que el rotulo dice “Buscar Factura por ID”, filtraba por CLIENTE = @cliente en vez de por el numero de factura, asi que escribir un numero de factura real no encontraba nada. Ahora filtra FACTURA LIKE (parcial) y, si el campo esta vacio, muestra todas las facturas activas; frmVENFACT_Load tambien llama BuscaData() una vez al abrir para no empezar con la lista en blanco. btnSeleccionar_Click ademas avisa con un mensaje si no hay ninguna fila seleccionada, en vez de cerrar la ventana sin hacer nada. Por ultimo, BuscarFactura() hacia INNER JOIN CLIENTES B ON A.CLIENTE = B.IDCLIENTE: si el codigo de cliente guardado en esa factura no encontraba pareja exacta (espacio de mas, cliente muy viejo, etc.), la factura entera desaparecia de la busqueda sin ningun aviso — “a veces si, a veces no” segun la factura. Ahora es LEFT JOIN (la factura carga igual, solo el nombre del cliente queda vacio si no hay coincidencia) y, si de verdad no existe esa factura o esta anulada, muestra un MessageBox en vez de quedarse en silencio. frmVENCTE.btnSeleccionar_Click tenia el mismo bug de fondo que frmVENFACT: guardaba var1/var2 pero nunca cerraba el dialogo, asi que quien llamaba ShowDialog() (frmFactura, frmPuntoVenta) se quedaba esperando y “Seleccionar” parecia no hacer nada hasta cerrar la ventana a mano. Ahora SeleccionarClienteActual() hace DialogResult = OK y Close() al elegir. De paso se agrego navegacion por teclado en su dgv: Enter selecciona (igual que el boton), y Tab/Shift+Tab mueven la fila activa hacia abajo/arriba en vez de saltar de columna (las flechas arriba/abajo ya navegaban filas por comportamiento nativo de DataGridView, pero necesitaban una celda activa; BuscaData() ahora deja seleccionada la primera fila tras cada busqueda para que funcionen de inmediato). SelectionMode se puso en FullRowSelect para que se vea resaltada la fila completa, no solo una celda. Se agrego un boton Nuevo Cliente que abre frmCliente como dialogo modal (frm.ShowDialog(this)) y vuelve a llamar BuscaData() al cerrarse, por si el cliente recien creado ya aparece en la busqueda. frmVENPRO recibio el mismo tratamiento: se le agrego un boton Nuevo Producto (abre frmProductos modal) y la misma navegacion por teclado en su dgv (Enter selecciona, Tab/Shift+Tab mueve la fila activa); btnSeleccionar_Click ahora tambien avisa si no hay fila seleccionada en vez de no hacer nada. De paso se corrigio que BuscaData() de frmVENPRO no filtraba por ESTATUSPRODUCTO, asi que un producto ya desactivado podia aparecer y venderse igual desde el buscador; ahora exige ESTATUSPRODUCTO = 1, igual que el resto del sistema. Abrir frmCliente/frmProductos como dialogo modal desde estos buscadores exigio ademas corregir btnSalir_Click en esos dos formularios: siempre hacian frmMenu().Show() al cerrarse, pensados solo para cuando se abren directo desde el menu principal; si se abren anidados (Punto de Venta -&gt; frmVENCTE -&gt; frmCliente, por ejemplo) eso dejaba un frmMenu extra abierto de fondo sin que nadie lo pidiera. Ahora ambos revisan this.Modal (true cuando se abrieron con ShowDialog()) y sólo reabren el menu principal si NO es el caso. Nota: todo lo anterior sobre frmVENPRO quedo sin usarse casi enseguida: se reemplazo por frmConsultaArticulos (ver mas abajo) tanto en frmFactura como en frmPuntoVenta por una pantalla mas completa (con existencia e impuesto). frmVENPRO sigue compilando y funcionando si se abre a mano, pero ya ningun formulario lo llama; es codigo huerfano que se puede borrar mas adelante.</w:t>
             </w:r>
           </w:p>
         </w:tc>
@@ -2191,7 +2191,29 @@
           </w:tcPr>
           <w:p>
             <w:r>
-              <w:t>Venta rapida de mostrador (menu Punto de Venta): escribir/escanear un codigo y Enter agrega la linea (o suma la cantidad si el articulo ya estaba en el carrito); Cobrar (F2) guarda la factura, genera el PDF y lo manda a imprimir en un solo paso. Cliente por defecto “Consumidor Final” (Cambiar = F4, reutiliza frmVENCTE) y Tipo de Comprobante preseleccionado en el primero cuyo nombre contenga “Consumo”. No duplica logica de negocio: llama a los mismos ComprobanteFiscal/FacturaService que usa frmFactura (ver 6.1 Reuso de FacturaService)</w:t>
+              <w:t>Venta rapida de mostrador (menu Punto de Venta): escribir/escanear un codigo y Enter agrega la linea (o suma la cantidad si el articulo ya estaba en el carrito); Buscar (F3) abre frmConsultaArticulos para buscar el articulo por descripcion en vez de escribir el codigo. Cobrar (F2) guarda la factura, genera el PDF y lo manda a imprimir en un solo paso. Cliente: txtClienteCodigo (Leave/Enter llama BuscarClientePorCodigo(), que hace el mismo SELECT NOMBRE FROM CLIENTES WHERE IDCLIENTE = @id que BuscarCliente() de frmFactura) + txtNombreCliente, con Cambiar (F4, reutiliza frmVENCTE). Por defecto arranca en “Consumidor Final” (consumidorFinalId) y Tipo de Comprobante preseleccionado en el primero cuyo nombre contenga “Consumo”. AplicarCliente(id, nombre) centraliza el cambio de cliente (por codigo, por Cambiar, o al reiniciar tras cobrar) y sólo deja txtNombreCliente editable cuando el cliente activo es consumidorFinalId: así se puede escribir el nombre real del comprador en el recibo de una venta de mostrador sin crear un cliente nuevo (el FK que se graba en HFACTURA.cliente sigue siendo el de Consumidor Final), sin permitir alterar el nombre de un cliente ya registrado (mismo criterio que ActualizarEditabilidadNombre() en frmFactura). No duplica logica de negocio: llama a los mismos ComprobanteFiscal/FacturaService que usa frmFactura (ver 6.1 Reuso de FacturaService)</w:t>
+            </w:r>
+          </w:p>
+        </w:tc>
+      </w:tr>
+      <w:tr>
+        <w:tc>
+          <w:tcPr>
+            <w:tcW w:type="dxa" w:w="2835"/>
+          </w:tcPr>
+          <w:p>
+            <w:r>
+              <w:t>frmConsultaArticulos</w:t>
+            </w:r>
+          </w:p>
+        </w:tc>
+        <w:tc>
+          <w:tcPr>
+            <w:tcW w:type="dxa" w:w="5669"/>
+          </w:tcPr>
+          <w:p>
+            <w:r>
+              <w:t>Busca productos activos por codigo o descripcion, mostrando existencia, precio e impuesto; comparte esta misma pantalla frmFactura.btnArticulo_Click (F4 desde el campo Articulo) y frmPuntoVenta.btnBuscarArticulo_Click (F3), en vez de tener cada una su propia ventana de busqueda de productos. Enter o doble clic selecciona y cierra (SeleccionarProductoActual()); Tab/Shift+Tab mueven la fila activa hacia abajo/arriba. El boton Nuevo Producto abre frmProductos como dialogo modal y refresca la busqueda al volver. Reemplaza a frmVENPRO en ambos formularios (ver nota en la fila de frmVENCTE / frmVENPRO / frmVENFACT)</w:t>
             </w:r>
           </w:p>
         </w:tc>
@@ -2964,6 +2986,14 @@
         <w:t>frmPuntoVenta (igual que frmFactura) no valida la existencia contra el inventario antes de vender: se puede cobrar mas cantidad de un articulo de la que hay en PRODUCTOS.cantidad, dejandola en negativo.</w:t>
       </w:r>
     </w:p>
+    <w:p>
+      <w:pPr>
+        <w:pStyle w:val="ListBullet"/>
+      </w:pPr>
+      <w:r>
+        <w:t>El nombre libre que se puede escribir para una venta a Consumidor Final (frmFactura y frmPuntoVenta) sólo queda grabado en el PDF generado en ese momento: HFACTURA no tiene una columna aparte para el nombre impreso, así que si se vuelve a abrir esa factura mas tarde (por ejemplo con la lupa de Numero Factura), el campo de nombre vuelve a mostrar el nombre real de CLIENTES ("Consumidor Final"), no el que se escribio a mano en su momento.</w:t>
+      </w:r>
+    </w:p>
     <w:sectPr>
       <w:pgSz w:w="12240" w:h="15840"/>
       <w:pgMar w:top="1134" w:right="1417" w:bottom="1134" w:left="1417" w:header="720" w:footer="720" w:gutter="0"/>

</xml_diff>

<commit_message>
Corregir que Andrómeda quedaba corriendo en segundo plano al cerrar con la X
frmSplashScreen es el MainForm de Application.Run pero nunca se cierra
(solo se oculta), y ningún formulario sobreescribe FormClosing. Cerrar
cualquier pantalla con la X de la ventana dejaba el proceso vivo sin
ninguna ventana visible. Program.cs ahora vigila con Application.Idle
si ya no queda ninguna ventana visible y llama a Application.Exit().

Co-Authored-By: Claude Sonnet 5 <noreply@anthropic.com>
Claude-Session: https://claude.ai/code/session_01HUAM3Xek842nWRcQgxav8A
</commit_message>
<xml_diff>
--- a/MANUAL_TECNICO.docx
+++ b/MANUAL_TECNICO.docx
@@ -76,7 +76,7 @@
           <w:color w:val="555555"/>
           <w:sz w:val="20"/>
         </w:rPr>
-        <w:t>Version del documento: 12/09/2026</w:t>
+        <w:t>Version del documento: 13/09/2026</w:t>
       </w:r>
     </w:p>
     <w:p>
@@ -3531,6 +3531,32 @@
     </w:p>
     <w:p>
       <w:pPr>
+        <w:pStyle w:val="Heading2"/>
+      </w:pPr>
+      <w:r>
+        <w:t>6.4 Ciclo de vida de la aplicación y cierre (Program.cs)</w:t>
+      </w:r>
+    </w:p>
+    <w:p>
+      <w:pPr/>
+      <w:r>
+        <w:t>La navegación entre pantallas usa this.Hide() + nuevoForm.Show() (splash → login → menú → pantallas de trabajo), nunca ShowDialog() ni un cierre real entre ellas. Como ningún formulario sobreescribe FormClosing, cerrar una ventana con la X no terminaba la aplicación por sí solo: Application.Run(new frmSplashScreen()) hace que frmSplashScreen sea el "MainForm" que WinForms vigila para decidir cuándo salir del bucle de mensajes, y frmSplashScreen solo se oculta (Hide()), nunca se cierra.</w:t>
+      </w:r>
+    </w:p>
+    <w:p>
+      <w:pPr/>
+      <w:r>
+        <w:t>Corregido: Program.cs engancha Application.Idle para revisar, en cada ciclo ocioso, si ya no queda ninguna ventana visible (Application.OpenForms.Cast&lt;Form&gt;().Any(f =&gt; f.Visible)) — ignorando formularios ocultos como el splash o los que quedan atrás tras "Cerrar sesión" — y llama a Application.Exit() en ese caso.</w:t>
+      </w:r>
+    </w:p>
+    <w:p>
+      <w:pPr/>
+      <w:r>
+        <w:t>Antes de este arreglo, cerrar cualquier pantalla de trabajo con la X (en vez de Escape o "Cerrar Programa", que sí llaman Application.Exit() explícitamente) dejaba el proceso Andromeda.exe corriendo en segundo plano sin ninguna ventana visible.</w:t>
+      </w:r>
+    </w:p>
+    <w:p>
+      <w:pPr>
         <w:pStyle w:val="Heading1"/>
       </w:pPr>
       <w:r>

</xml_diff>

<commit_message>
Actualizar manuales con la nueva funcionalidad de descuentos
MANUAL_USUARIO: cómo aplicar descuento por factura y por línea en Factura y
Punto de Venta, y los topes configurables en Datos de la Empresa.
MANUAL_TECNICO: nueva sección 5.5 documentando las columnas EMPRESA/HFACTURA/
DFACTURA agregadas y la regla de cálculo sobre el Total; corrige la lista de
campos de LineaFactura en la sección 6.1.

Co-Authored-By: Claude Sonnet 5 <noreply@anthropic.com>
Claude-Session: https://claude.ai/code/session_01Titn57E6kseiy3rkaPWWiA
</commit_message>
<xml_diff>
--- a/MANUAL_TECNICO.docx
+++ b/MANUAL_TECNICO.docx
@@ -2581,6 +2581,50 @@
     </w:p>
     <w:p>
       <w:pPr>
+        <w:pStyle w:val="Heading2"/>
+      </w:pPr>
+      <w:r>
+        <w:t>5.5 Descuentos (factura y por línea)</w:t>
+      </w:r>
+    </w:p>
+    <w:p>
+      <w:pPr>
+        <w:pStyle w:val="ListBullet"/>
+      </w:pPr>
+      <w:r>
+        <w:t>EMPRESA.descuentoMaxPorcentaje / descuentoMaxMonto (Configuración → Datos de la Empresa, frmDatosEmpresa) son los topes máximos configurables, independientes entre sí; NULL en cualquiera de los dos significa "sin límite" para ese modo. Se validan tanto al guardar esa pantalla como al aplicar el descuento en Factura/Punto de Venta (por si la configuración cambió mientras se armaba la venta).</w:t>
+      </w:r>
+    </w:p>
+    <w:p>
+      <w:pPr>
+        <w:pStyle w:val="ListBullet"/>
+      </w:pPr>
+      <w:r>
+        <w:t>Descuento de toda la factura (HFACTURA.descuento/descuentoValor/descuentoEsPorcentaje): el cajero elige Porcentaje o Monto fijo (RD$) en un solo campo por factura/venta. descuento es el monto ya calculado (lo que de verdad se resta); descuentoValor/descuentoEsPorcentaje guardan el valor tal cual se escribió (10 + true = "10%", 100.00 + false = "RD$100.00"), sólo para poder reimprimir/mostrar la factura tal como se aplicó.</w:t>
+      </w:r>
+    </w:p>
+    <w:p>
+      <w:pPr>
+        <w:pStyle w:val="ListBullet"/>
+      </w:pPr>
+      <w:r>
+        <w:t>Descuento por línea (DFACTURA.descuentoLinea/impuestoBruto/montoLineaBruto): sólo Monto fijo (RD$), aplicado a una línea puntual desde frmFactura (campo junto a Cantidad/Precio, o el botón "Aplicar Desc. a Todas") o frmPuntoVenta (columna Descuento editable en el carrito, o los botones "Aplicar a línea"/"Aplicar a todas"). IMPUESTO/MONTOLINEA de esa fila ya salen calculados con este descuento aplicado; impuestoBruto/montoLineaBruto guardan los mismos valores SIN el descuento de línea, para poder recalcular/editar la línea sin volver a consultar el artículo. Los dos descuentos (por línea y de toda la factura) se pueden combinar: primero se aplica el de línea, y el de factura se calcula después sobre el total que ya incluye los descuentos de línea.</w:t>
+      </w:r>
+    </w:p>
+    <w:p>
+      <w:pPr/>
+      <w:r>
+        <w:t>Regla de cálculo, en ambos niveles: el descuento SIEMPRE se calcula sobre el Total (subtotal + impuesto), nunca sobre el Subtotal, y subtotal/impuesto se escalan por el mismo factor (descuento / total). Esto es necesario para que el monto realmente descontado sea exacto sin importar si el artículo tiene ITBIS incluido en el precio o no: si se calculara sobre el Subtotal, un descuento fijo de RD$100 en un artículo con ITBIS incluido terminaría quitando más de RD$100 del Total (el impuesto también se reduciría de más). Ver CalcularDescuento()/ValidarDescuento() en Formularios/frmFactura.cs y frmPuntoVenta.cs.</w:t>
+      </w:r>
+    </w:p>
+    <w:p>
+      <w:pPr/>
+      <w:r>
+        <w:t>Nota: Facturas guardadas antes de agregar esta funcionalidad no tienen datos en las columnas nuevas; frmFactura.BuscarDetalle() y Empresa.ObtenerDatos() tratan esos NULL como "sin descuento"/"sin límite" al recargarlas, así que reabrir una factura vieja sigue funcionando igual que antes.</w:t>
+      </w:r>
+    </w:p>
+    <w:p>
+      <w:pPr>
         <w:pStyle w:val="Heading1"/>
       </w:pPr>
       <w:r>
@@ -3247,7 +3291,7 @@
           <w:b w:val="0"/>
           <w:i w:val="0"/>
         </w:rPr>
-        <w:t>LineaFactura (Articulo, Descripcion, Cantidad, PrecioVenta, Impuesto, MontoLinea) es la línea ya calculada que ambos formularios arman antes de llamar a GuardarFactura()/GenerarPdf(). frmFactura la arma leyendo su dgv (ArmarLineas()); frmPuntoVenta usa una subclase privada LineaCarrito que le agrega TasaImpuesto e ImpuestoIncluido (necesarios para recalcular una linea si el cajero corrige la cantidad a mano), y al cobrar convierte cada fila del carrito directo a LineaFactura sin duplicar campos.</w:t>
+        <w:t>LineaFactura (Articulo, Descripcion, Cantidad, PrecioVenta, Impuesto, MontoLinea, DescuentoLinea, ImpuestoBruto, MontoLineaBruto — ver 5.5) es la línea ya calculada que ambos formularios arman antes de llamar a GuardarFactura()/GenerarPdf(). frmFactura la arma leyendo su dgv (ArmarLineas()); frmPuntoVenta usa una subclase privada LineaCarrito que le agrega TasaImpuesto e ImpuestoIncluido (necesarios para recalcular una linea si el cajero corrige la cantidad a mano), y al cobrar convierte cada fila del carrito directo a LineaFactura sin duplicar campos.</w:t>
       </w:r>
     </w:p>
     <w:p>

</xml_diff>

<commit_message>
Agregar módulo de Gastos/Egresos (Registro → Gastos)
Nueva pantalla frmGastos y tabla GASTOS para registrar egresos del negocio
que no son una venta ni una compra de inventario (gastos operativos, retiros
de utilidades de los socios), pensada para reemplazar el control que se
llevaba aparte en Excel. Grid editable con Nuevo/Guardar en lote (estilo
Tipos de Pago), filtro por fecha/estado y Anular con baja lógica (estilo
Reporte de Factura), y exportar a CSV.

Actualiza MEJORAS_PENDIENTES.txt y ambos manuales.

Co-Authored-By: Claude Sonnet 5 <noreply@anthropic.com>
Claude-Session: https://claude.ai/code/session_01Titn57E6kseiy3rkaPWWiA
</commit_message>
<xml_diff>
--- a/MANUAL_TECNICO.docx
+++ b/MANUAL_TECNICO.docx
@@ -3570,7 +3570,7 @@
           <w:i/>
           <w:color w:val="555555"/>
         </w:rPr>
-        <w:t>Nota: En frmMenu estan conectados a un formulario los items Registro -&gt; Productos, Cliente, Usuario y Factura, Punto de Venta (item de primer nivel, junto a Registro), Configuracion -&gt; Comprobantes Fiscales, Datos de la Empresa y Tipos de Pago, Reporte -&gt; Factura e Inventario, Consulta -&gt; Estado de Cuenta y Alfabetico de Clientes, ademas de Salir y Cerrar Sesion. Los items Opciones del Menu / Permiso a Usuario dentro de Configuracion, y Puesto de Trabajo / Departamento dentro de Registro, existen visualmente pero no tienen manejador de clic (_Click) implementado todavia.</w:t>
+        <w:t>Nota: En frmMenu estan conectados a un formulario los items Registro -&gt; Productos, Cliente, Usuario, Factura y Gastos, Punto de Venta (item de primer nivel, junto a Registro), Configuracion -&gt; Comprobantes Fiscales, Datos de la Empresa y Tipos de Pago, Reporte -&gt; Factura e Inventario, Consulta -&gt; Estado de Cuenta y Alfabetico de Clientes, ademas de Salir y Cerrar Sesion. Los items Opciones del Menu / Permiso a Usuario dentro de Configuracion, y Puesto de Trabajo / Departamento dentro de Registro, existen visualmente pero no tienen manejador de clic (_Click) implementado todavia.</w:t>
       </w:r>
     </w:p>
     <w:p>
@@ -3597,6 +3597,32 @@
       <w:pPr/>
       <w:r>
         <w:t>Antes de este arreglo, cerrar cualquier pantalla de trabajo con la X (en vez de Escape o "Cerrar Programa", que sí llaman Application.Exit() explícitamente) dejaba el proceso Andromeda.exe corriendo en segundo plano sin ninguna ventana visible.</w:t>
+      </w:r>
+    </w:p>
+    <w:p>
+      <w:pPr>
+        <w:pStyle w:val="Heading2"/>
+      </w:pPr>
+      <w:r>
+        <w:t>6.5 Gastos (Formularios/frmGastos.cs, tabla GASTOS)</w:t>
+      </w:r>
+    </w:p>
+    <w:p>
+      <w:pPr/>
+      <w:r>
+        <w:t>Registro → Gastos (frmGastos) registra egresos del negocio que no son una venta ni una compra de inventario (gastos operativos, retiros de utilidades de los socios), para reemplazar el control que antes se llevaba aparte en una hoja de Excel (ver 4) REEMPLAZAR EL CONTROL MANUAL EN EXCEL en MEJORAS_PENDIENTES.txt). Tabla GASTOS (id, fecha, concepto, categoria, monto, activo); fecha se guarda como texto (dd/MM/yyyy), igual que HFACTURA.fecha y RECIBO.fecha, por consistencia con el resto del sistema.</w:t>
+      </w:r>
+    </w:p>
+    <w:p>
+      <w:pPr/>
+      <w:r>
+        <w:t>El formulario combina el patron editable de frmTiposPago (grid editable; Nuevo agrega una fila en blanco con Tag = null; Guardar hace INSERT para las filas con Tag == null y UPDATE para las que tienen Tag = su id) con el patron de filtro y baja logica de frmReporteFactura (Fecha Desde/Hasta y Estado se filtran en memoria despues de leer todo GASTOS, igual razon que alli: fecha es texto, no se puede ordenar/filtrar por rango directo en SQL; Anular Gasto sólo pone activo = 0, nunca DELETE).</w:t>
+      </w:r>
+    </w:p>
+    <w:p>
+      <w:pPr/>
+      <w:r>
+        <w:t>No está integrado (todavía) con ningun reporte financiero consolidado ni con Estado de Cuenta/MUTOCTE: es un registro independiente, sin relacion con clientes, facturas ni inventario.</w:t>
       </w:r>
     </w:p>
     <w:p>

</xml_diff>

<commit_message>
Agregar Notas de Credito y Notas de Debito, reporte de Ordenes de Compra
Ventas -> Nota de Credito: devuelve productos de una factura ya guardada
(prorratea el monto contra la linea original, revierte inventario y reduce
lo que debe el cliente); Ventas -> Nota de Debito: cargo adicional plano
(flete, correccion de precio, mora) sin lineas ni inventario, reutilizando
CuentaCliente.RegistrarCargo/AnularCargosDeFactura tal cual. Ambas con NCF
propio (E34 y los nuevos B03/E33). Reporte -> Ordenes de Compra cubre
pendientes de recibir y compras por proveedor en un rango.

Co-Authored-By: Claude Sonnet 5 <noreply@anthropic.com>
Claude-Session: https://claude.ai/code/session_01Titn57E6kseiy3rkaPWWiA
</commit_message>
<xml_diff>
--- a/MANUAL_TECNICO.docx
+++ b/MANUAL_TECNICO.docx
@@ -2665,6 +2665,94 @@
     </w:p>
     <w:p>
       <w:pPr>
+        <w:pStyle w:val="Heading2"/>
+      </w:pPr>
+      <w:r>
+        <w:t>5.7 Notas de Crédito (NOTACREDITO/DNOTACREDITO, Clases/NotaCreditoService.cs)</w:t>
+      </w:r>
+    </w:p>
+    <w:p>
+      <w:pPr>
+        <w:pStyle w:val="ListBullet"/>
+      </w:pPr>
+      <w:r>
+        <w:t>El número interno (NOTACREDITO.numero) lleva el prefijo "NC" (ej. "NC1"), a propósito distinto de los números de RECIBO (siempre numéricos): ambos pueden aparecer como MUTOCTE.documento de un abono, y el prefijo evita que un recibo y una nota de crédito con el mismo número interno se confundan al hacer el LEFT JOIN en CuentaCliente.ObtenerMovimientos(). El comprobanteFiscal (NCF real, ej. tipo E34 "Nota de Crédito Electrónica", ya sembrado en TIPOCOMPROBANTE) es independiente y usa Clases/ComprobanteFiscal.cs igual que HFACTURA.</w:t>
+      </w:r>
+    </w:p>
+    <w:p>
+      <w:pPr>
+        <w:pStyle w:val="ListBullet"/>
+      </w:pPr>
+      <w:r>
+        <w:t>NotaCreditoService.ObtenerLineasDisponibles(factura) calcula, por cada línea de DFACTURA, cuánto ya se acreditó en notas de crédito ACTIVAS previas (SUM de DNOTACREDITO vía JOIN con NOTACREDITO.factura) y cuánto queda disponible; GuardarNotaCredito() vuelve a revalidar esa disponibilidad DENTRO de la transacción antes de insertar (no sólo con lo ya calculado en pantalla), para no sobre-acreditar si dos notas de crédito de la misma factura se guardan casi al mismo tiempo.</w:t>
+      </w:r>
+    </w:p>
+    <w:p>
+      <w:pPr>
+        <w:pStyle w:val="ListBullet"/>
+      </w:pPr>
+      <w:r>
+        <w:t>CalcularCredito() prorratea el subtotal/impuesto de la línea ORIGINAL de DFACTURA (que ya refleja cualquier descuento que tenía esa factura, ver 5.5) según la fracción de la cantidad que se devuelve, en vez de recalcular a precio de catálogo completo.</w:t>
+      </w:r>
+    </w:p>
+    <w:p>
+      <w:pPr>
+        <w:pStyle w:val="ListBullet"/>
+      </w:pPr>
+      <w:r>
+        <w:t>Al guardar: InventarioService.RegistrarMovimiento() devuelve cada línea al inventario (origen "NotaCredito") y CuentaCliente.RegistrarAbonoDirecto() (nuevo, mismo patrón que RegistrarCargo pero para un abono sin pasar por RECIBO/forma de pago) reduce lo que debe el cliente. CuentaCliente.ObtenerMontoPagadoDeFactura() ahora suma también las notas de crédito activas de esa factura, así que Estado de Cuenta sigue mostrando SALDADA/PENDIENTE correctamente sin cambios en frmEstadoCuenta más allá de distinguir el nuevo MovimientoCuenta.EsNotaCredito para etiquetar el tipo de movimiento.</w:t>
+      </w:r>
+    </w:p>
+    <w:p>
+      <w:pPr>
+        <w:pStyle w:val="ListBullet"/>
+      </w:pPr>
+      <w:r>
+        <w:t>AnularNotaCredito() revierte la entrada de inventario (Salida, origen "AnulacionNotaCredito") y llama CuentaCliente.AnularAbono() (nuevo, mismo patrón que AnularCargosDeFactura) para que el cliente vuelva a deber ese monto. Una nota ya guardada no se puede editar (frmNotaCredito la deja de solo lectura salvo Anular/Imprimir), mismo criterio que Órdenes de Compra (ver 5.6).</w:t>
+      </w:r>
+    </w:p>
+    <w:p>
+      <w:pPr>
+        <w:pStyle w:val="Heading2"/>
+      </w:pPr>
+      <w:r>
+        <w:t>5.8 Notas de Débito (NOTADEBITO, Clases/NotaDebitoService.cs)</w:t>
+      </w:r>
+    </w:p>
+    <w:p>
+      <w:pPr>
+        <w:pStyle w:val="ListBullet"/>
+      </w:pPr>
+      <w:r>
+        <w:t>El número interno (NOTADEBITO.numero) lleva el prefijo "ND" (ej. "ND1"), mismo motivo que el prefijo "NC" de Nota de Crédito (ver 5.7): distinguirlo de RECIBO.recibo al hacer el LEFT JOIN en CuentaCliente.ObtenerMovimientos(). El comprobanteFiscal usa dos tipos nuevos sembrados en TIPOCOMPROBANTE: B03 "Nota de Débito" (físico) y E33 "Nota de Débito Electrónica" (no existían antes; sólo se había sembrado E34 para Nota de Crédito).</w:t>
+      </w:r>
+    </w:p>
+    <w:p>
+      <w:pPr>
+        <w:pStyle w:val="ListBullet"/>
+      </w:pPr>
+      <w:r>
+        <w:t>A diferencia de Nota de Crédito, NOTADEBITO no tiene tabla de detalle ni pasa por InventarioService: es un cargo plano (subtotal + impuesto = monto) con un concepto libre, sin líneas de artículo ni devolución de inventario.</w:t>
+      </w:r>
+    </w:p>
+    <w:p>
+      <w:pPr>
+        <w:pStyle w:val="ListBullet"/>
+      </w:pPr>
+      <w:r>
+        <w:t>GuardarNotaDebito() reutiliza CuentaCliente.RegistrarCargo() tal cual (el mismo método que usa FacturaService.GuardarFactura() para el cargo de una factura), sin agregar ningún método nuevo a CuentaCliente.cs, porque ya es genérico: sólo graba un DOCUMENTO/MONTO en MUTOCTE sin validar que el documento sea una HFACTURA real.</w:t>
+      </w:r>
+    </w:p>
+    <w:p>
+      <w:pPr>
+        <w:pStyle w:val="ListBullet"/>
+      </w:pPr>
+      <w:r>
+        <w:t>AnularNotaDebito() reutiliza CuentaCliente.AnularCargosDeFactura() de la misma forma (filtra por DOCUMENTO, sin importar si es un número de factura o de nota de débito). Una nota ya guardada no se puede editar (frmNotaDebito la deja de solo lectura salvo Anular/Imprimir), mismo criterio que Nota de Crédito y Órdenes de Compra.</w:t>
+      </w:r>
+    </w:p>
+    <w:p>
+      <w:pPr>
         <w:pStyle w:val="Heading1"/>
       </w:pPr>
       <w:r>
@@ -3610,7 +3698,7 @@
           <w:i/>
           <w:color w:val="555555"/>
         </w:rPr>
-        <w:t>Nota: En frmMenu estan conectados a un formulario los items Registro -&gt; Productos, Usuario, Gastos, Ordenes de Compra y Movimientos de Inventario, Ventas (item de primer nivel nuevo, reemplaza el viejo item suelto "Punto de Venta") -&gt; Factura, Punto de Venta y Reporte de Factura, Cuentas por Cobrar (item de primer nivel nuevo, reemplaza el viejo "Consulta") -&gt; Cliente, Estado de Cuenta y Alfabetico de Clientes, Cuentas por Pagar (item de primer nivel nuevo) -&gt; Proveedores y Cuenta por Pagar, Configuracion -&gt; Comprobantes Fiscales, Datos de la Empresa y Tipos de Pago, Reporte -&gt; Inventario y Consolidado, ademas de Salir y Cerrar Sesion. Los items Opciones del Menu / Permiso a Usuario dentro de Configuracion, y Puesto de Trabajo / Departamento dentro de Registro, existen visualmente pero no tienen manejador de clic (_Click) implementado todavia.</w:t>
+        <w:t>Nota: En frmMenu estan conectados a un formulario los items Registro -&gt; Productos, Usuario, Gastos, Ordenes de Compra y Movimientos de Inventario, Ventas (item de primer nivel nuevo, reemplaza el viejo item suelto "Punto de Venta") -&gt; Factura, Punto de Venta, Nota de Crédito, Nota de Débito y Reporte de Factura, Cuentas por Cobrar (item de primer nivel nuevo, reemplaza el viejo "Consulta") -&gt; Cliente, Estado de Cuenta y Alfabetico de Clientes, Cuentas por Pagar (item de primer nivel nuevo) -&gt; Proveedores y Cuenta por Pagar, Configuracion -&gt; Comprobantes Fiscales, Datos de la Empresa y Tipos de Pago, Reporte -&gt; Inventario, Consolidado y Órdenes de Compra, ademas de Salir y Cerrar Sesion. Los items Opciones del Menu / Permiso a Usuario dentro de Configuracion, y Puesto de Trabajo / Departamento dentro de Registro, existen visualmente pero no tienen manejador de clic (_Click) implementado todavia.</w:t>
       </w:r>
     </w:p>
     <w:p>
@@ -3707,6 +3795,38 @@
     </w:p>
     <w:p>
       <w:pPr>
+        <w:pStyle w:val="Heading2"/>
+      </w:pPr>
+      <w:r>
+        <w:t>6.7 Notas de Crédito, Notas de Débito y Reporte de Órdenes de Compra</w:t>
+      </w:r>
+    </w:p>
+    <w:p>
+      <w:pPr>
+        <w:pStyle w:val="ListBullet"/>
+      </w:pPr>
+      <w:r>
+        <w:t>frmNotaCredito: la grilla NO se compone línea por línea como frmFactura (no hay "Insertar Línea"); en vez de eso, carga TODAS las líneas de la factura de referencia con columnas de solo lectura (Facturado/Ya Acreditado/Disponible) más una columna editable "Cantidad a Devolver", y dgv_CellEndEdit topa cada valor contra el Disponible de esa fila en vivo. Al reabrir una nota ya guardada (txtNumero_Leave), las mismas columnas de solo lectura quedan vacías (no aplican) y sólo se muestra la cantidad que realmente se devolvió.</w:t>
+      </w:r>
+    </w:p>
+    <w:p>
+      <w:pPr>
+        <w:pStyle w:val="ListBullet"/>
+      </w:pPr>
+      <w:r>
+        <w:t>frmReporteOrdenesCompra (Reporte -&gt; Órdenes de Compra): mismo patrón de filtro que frmReporteFactura (fecha en memoria por ser texto), pero cubre dos necesidades con una sola pantalla -- "pendientes de recibir" (filtrar Estado = Pendiente) y "compras por proveedor en un rango" (filtrar Proveedor + fechas) -- en vez de dos reportes separados. El total mostrado excluye las órdenes Anuladas.</w:t>
+      </w:r>
+    </w:p>
+    <w:p>
+      <w:pPr>
+        <w:pStyle w:val="ListBullet"/>
+      </w:pPr>
+      <w:r>
+        <w:t>frmNotaDebito: mucho más simple que frmNotaCredito (sin DataGridView) — campos de encabezado únicamente (factura de referencia, comprobante fiscal, concepto, subtotal, ITBIS); el Total se recalcula en vivo con cada Leave de los campos de monto en vez de sumar filas de una grilla.</w:t>
+      </w:r>
+    </w:p>
+    <w:p>
+      <w:pPr>
         <w:pStyle w:val="Heading1"/>
       </w:pPr>
       <w:r>
@@ -4210,14 +4330,6 @@
       </w:pPr>
       <w:r>
         <w:t>Agregar try/catch a los accesos a datos que todavia no lo tienen, y algun tipo de bloqueo o aviso tras varios intentos de login fallidos seguidos (ver seccion 9).</w:t>
-      </w:r>
-    </w:p>
-    <w:p>
-      <w:pPr>
-        <w:pStyle w:val="ListBullet"/>
-      </w:pPr>
-      <w:r>
-        <w:t>Notas de credito con su propio comprobante fiscal (no solo anular la factura y devolver el inventario, sino emitir un NCF de nota de credito para cumplir con la DGII).</w:t>
       </w:r>
     </w:p>
     <w:p>

</xml_diff>

<commit_message>
Agregar permisos por rol y corregir menu vacio para todos los usuarios
Sesion/RolService/Permisos nuevos, pantalla Configuracion -> Permisos por
Rol (reemplaza el item muerto "Permiso a Usuario"), combo de Rol en
Registro -> Usuario, y ocultamiento + revalidacion de permisos en frmMenu
y frmFactura.btnBorrar_Click. Administrador sembrado con los 25 permisos,
Cajero con 11 ("solo vender").

Verificando esto a mano contra la app real (login real como admin) se
encontro que frmMenu ocultaba el menu completo dejando solo "Salir"
visible para cualquier rol: AplicarPermisos() usaba .Visible para leer de
vuelta el estado de los items hijos de un dropdown y decidir la
visibilidad del item padre, pero ese getter siempre da false para un
ToolStripMenuItem hijo de un dropdown que no esta abierto. Corregido
usando .Available en su lugar.

Manuales y documentos de seguimiento actualizados.

Co-Authored-By: Claude Sonnet 5 <noreply@anthropic.com>
</commit_message>
<xml_diff>
--- a/MANUAL_TECNICO.docx
+++ b/MANUAL_TECNICO.docx
@@ -3778,7 +3778,7 @@
           <w:i/>
           <w:color w:val="555555"/>
         </w:rPr>
-        <w:t>Nota: En frmMenu estan conectados a un formulario los items Registro -&gt; Productos, Usuario, Gastos, Ordenes de Compra y Movimientos de Inventario, Ventas (item de primer nivel nuevo, reemplaza el viejo item suelto "Punto de Venta") -&gt; Factura, Punto de Venta, Nota de Crédito, Nota de Débito y Reporte de Factura, Cuentas por Cobrar (item de primer nivel nuevo, reemplaza el viejo "Consulta") -&gt; Cliente, Estado de Cuenta y Alfabetico de Clientes, Cuentas por Pagar (item de primer nivel nuevo) -&gt; Proveedores y Cuenta por Pagar, Configuracion -&gt; Comprobantes Fiscales, Datos de la Empresa y Tipos de Pago, Reporte -&gt; Inventario, Consolidado y Órdenes de Compra, ademas de Salir y Cerrar Sesion. Los items Opciones del Menu / Permiso a Usuario dentro de Configuracion, y Puesto de Trabajo / Departamento dentro de Registro, existen visualmente pero no tienen manejador de clic (_Click) implementado todavia.</w:t>
+        <w:t>Nota: En frmMenu estan conectados a un formulario los items Registro -&gt; Productos, Usuario, Gastos, Ordenes de Compra y Movimientos de Inventario, Ventas -&gt; Factura, Punto de Venta, Nota de Crédito, Nota de Débito y Reporte de Factura, Cuentas por Cobrar -&gt; Cliente, Estado de Cuenta y Alfabetico de Clientes, Cuentas por Pagar -&gt; Proveedores y Cuenta por Pagar, Configuracion -&gt; Permisos por Rol, Comprobantes Fiscales, Datos de la Empresa, Tipos de Pago, Monedas y Tasas de Cambio, Reporte -&gt; Inventario, Consolidado y Órdenes de Compra, ademas de Salir y Cerrar Sesion. Los items Opciones del Menu dentro de Configuracion, y Puesto de Trabajo / Departamento dentro de Registro, siguen existiendo visualmente sin manejador de clic (_Click) implementado -- "Permiso a Usuario" ya no esta en esa lista: se convirtio en "Permisos por Rol" (frmPermisosPorRol) con el 2026-09-16.</w:t>
       </w:r>
     </w:p>
     <w:p>
@@ -4256,6 +4256,22 @@
       </w:r>
     </w:p>
     <w:p>
+      <w:pPr>
+        <w:pStyle w:val="ListBullet"/>
+      </w:pPr>
+      <w:r>
+        <w:t>Permisos por rol: no existia ningun concepto de sesion (frmLogin validaba credenciales pero nunca guardaba quien habia iniciado sesion) ni de rol -- cualquier usuario veia y podia hacer todo. Se agrego Clases/Sesion.cs (quien inicio sesion y sus permisos en memoria, Puede()/Exigir()), Clases/RolService.cs (catalogo ROL/ROLPERMISO) y Clases/Permisos.cs (la lista fija de que se puede proteger: una constante por pantalla/accion sensible, 25 en total). Administrador sembrado con los 25; Cajero con 11 ("solo vender": Facturar, Punto de Venta, Notas de Credito/Debito, Clientes, Estado de Cuenta, Alfabetico y los 4 reportes -- sin ANULAR_FACTURA, Usuarios, Productos ni nada de Configuracion/Compras/Gastos). Todo usuario sin rol (incluido admin) quedo como Administrador en la migracion. frmMenu oculta cada item sin permiso Y revalida el mismo permiso dentro de cada Click (esconder un boton no es seguridad); frmFactura.btnBorrar_Click exige ANULAR_FACTURA aparte de FACTURAR. Pantalla nueva Configuracion -&gt; Permisos por Rol (frmPermisosPorRol, reemplaza el item de menu muerto "Permiso a Usuario") para crear roles y marcar/desmarcar permisos, mismo patron de grid + checkbox + "Guardar" por lote que ya usaba frmComprobantesFiscales.</w:t>
+      </w:r>
+    </w:p>
+    <w:p>
+      <w:pPr>
+        <w:pStyle w:val="ListBullet"/>
+      </w:pPr>
+      <w:r>
+        <w:t>Bug encontrado y corregido el 2026-09-17, verificando a mano contra la app compilada (login real como admin, automatizado): frmMenu ocultaba TODO el menu excepto “Salir” aunque Sesion tuviera los 25 permisos cargados correctamente. Causa: AplicarPermisos() usaba .Visible tanto para marcar cada item hoja como para leerlo de vuelta y decidir la visibilidad del item padre (ej. registroToolStripMenuItem.Visible = usuarioToolStripMenuItem.Visible || ...). El getter .Visible de un ToolStripMenuItem hijo de un dropdown que todavia no se abrio siempre da false (solo refleja si esta pintado en pantalla en ese instante), aunque el setter si haya actualizado el estado interno -- por eso todos los OR daban false y el menu entero quedaba oculto. Se cambiaron las 26 asignaciones/lecturas de .Visible a .Available en frmMenu.AplicarPermisos(), que no tiene ese problema. Con esto queda hecha la unica verificacion manual que faltaba de P1.6.</w:t>
+      </w:r>
+    </w:p>
+    <w:p>
       <w:r>
         <w:rPr>
           <w:b w:val="0"/>
@@ -4277,7 +4293,7 @@
         <w:pStyle w:val="ListBullet"/>
       </w:pPr>
       <w:r>
-        <w:t>No hay permisos por rol: cualquier usuario que entra ve y puede hacer todo (ver Pendientes, seccion 13).</w:t>
+        <w:t>Permisos por rol: RESUELTO el 2026-09-16 (ver arriba). Pendiente real que queda: sin bitacora de quien crea o anula una factura (quien lo hizo y cuando) -- facil de agregar ahora que existe Sesion.IdEmpleado, pero no se pidio en esta ronda.</w:t>
       </w:r>
     </w:p>
     <w:p>
@@ -4473,7 +4489,7 @@
         <w:pStyle w:val="ListBullet"/>
       </w:pPr>
       <w:r>
-        <w:t>Los items Opciones del Menu / Permiso a Usuario dentro de Configuracion no tienen formulario ni manejador de clic asociado todavia.</w:t>
+        <w:t>El item Opciones del Menu dentro de Configuracion no tiene formulario ni manejador de clic asociado todavia ("Permiso a Usuario" si: ver "Permisos por Rol" en la seccion 9).</w:t>
       </w:r>
     </w:p>
     <w:p>

</xml_diff>